<commit_message>
Update 中期检查表: remove FocalLoss, add top_k/weighted modes, update student model configs
Agent-Logs-Url: https://github.com/lawliet103110-art/dpft/sessions/00bfb8c1-4357-4150-b1f2-f43602239a99

Co-authored-by: lawliet103110-art <247488912+lawliet103110-art@users.noreply.github.com>
</commit_message>
<xml_diff>
--- a/中期检查表（填写版）.docx
+++ b/中期检查表（填写版）.docx
@@ -217,21 +217,47 @@
                 <w:b w:val="0"/>
                 <w:sz w:val="22"/>
               </w:rPr>
-              <w:t>（1）文献查阅与综述撰写：广泛查阅国内外知识蒸馏、多模态感知模型及轻量化方法相关文献共16篇，完成文献综述，系统梳理了研究现状与技术挑战。</w:t>
-              <w:br/>
+              <w:t>（1）文献查阅与综述撰写：广泛查阅国内外知识蒸馏、多模态感知模型及轻量化方法相关文献共20篇，完成文献综述，系统梳理了研究现状与技术挑战。</w:t>
+            </w:r>
+          </w:p>
+          <w:p>
+            <w:r>
               <w:t>（2）教师模型分析与理解：深入研究DPFT（Dual Perspective Fusion Transformer）多模态感知模型的网络结构与实现细节，包括双视角特征提取模块、IMPFusion跨模态融合机制及匈牙利匹配输出头，掌握了教师模型的知识蒸馏接口设计。</w:t>
-              <w:br/>
+            </w:r>
+          </w:p>
+          <w:p>
+            <w:r>
               <w:t>（3）知识蒸馏框架设计与实现：在DPFT代码库中，实现了完整的输出层知识蒸馏训练框架，主要包括：</w:t>
-              <w:br/>
-              <w:t xml:space="preserve">    ①DistillationLoss类：支持分类logits（KL散度）和边界框回归（L1损失）的联合蒸馏，引入温度参数T和两种蒸馏模式（matched/all）；</w:t>
-              <w:br/>
+            </w:r>
+          </w:p>
+          <w:p>
+            <w:r>
+              <w:t xml:space="preserve">    ①DistillationLoss类：支持分类logits（KL散度）和边界框回归（L1损失）的联合蒸馏，引入温度参数T和四种蒸馏模式（matched/all/top_k/weighted）；</w:t>
+            </w:r>
+          </w:p>
+          <w:p>
+            <w:r>
               <w:t xml:space="preserve">    ②KDLoss类：将标准检测损失与蒸馏损失通过权重α组合，实现端到端联合训练；</w:t>
-              <w:br/>
-              <w:t xml:space="preserve">    ③基于匹配的蒸馏模式（matched distillation）：结合匈牙利匹配算法，仅对与GT匹配的查询计算蒸馏损失，有效聚焦有意义的预测框，避免大量背景框稀释蒸馏效果。</w:t>
-              <w:br/>
-              <w:t>（4）学生模型配置设计：设计了三种不同压缩程度的学生模型配置（轻量级/中等/重度压缩），分别从骨干网络降级（ResNet101→ResNet50/ResNet34）、融合迭代次数减少（4→3）、查询数量缩减（400→256）等维度实现模型轻量化，对应参数量分别约为110M/85M/65M。</w:t>
-              <w:br/>
-              <w:t>（5）Focal Loss修复：发现并修复了原代码中Focal Loss实现的一处Bug（计算p_t时应先将logits转换为概率，再计算加权系数），提升了模型训练的稳定性。</w:t>
+            </w:r>
+          </w:p>
+          <w:p>
+            <w:r>
+              <w:t xml:space="preserve">    ③基于匹配的蒸馏模式（matched distillation）：结合匈牙利匹配算法，仅对与GT匹配的查询计算蒸馏损失，有效聚焦有意义的预测框，避免大量背景框稀释蒸馏效果；</w:t>
+            </w:r>
+          </w:p>
+          <w:p>
+            <w:r>
+              <w:t xml:space="preserve">    ④top_k蒸馏模式：按教师模型置信度选取前k个查询与学生侧对应索引进行知识迁移，在无需GT标注约束下实现高置信度区域的聚焦蒸馏；</w:t>
+            </w:r>
+          </w:p>
+          <w:p>
+            <w:r>
+              <w:t xml:space="preserve">    ⑤weighted蒸馏模式：对各查询蒸馏损失按教师置信度进行加权，使高置信度预测对蒸馏梯度贡献更大，进一步提升有效知识的传递效率。</w:t>
+            </w:r>
+          </w:p>
+          <w:p>
+            <w:r>
+              <w:t>（4）学生模型配置设计：设计了两种不同压缩程度的学生模型配置（轻量级/中等压缩），分别从骨干网络降级（ResNet101→ResNet50/ResNet34）、融合迭代次数减少（4→3）等维度实现模型轻量化，对应参数量分别约为85M/65M。重度压缩配置（low_memory）将查询数量nq从400降至100，实验发现无论采用何种蒸馏方法，检测精度均显著下降，已排除在实验对比范围之外。</w:t>
             </w:r>
           </w:p>
         </w:tc>

</xml_diff>

<commit_message>
docs: update midterm checklist issues and solutions for top_k experiments
Agent-Logs-Url: https://github.com/lawliet103110-art/dpft/sessions/01b28b74-e1a5-40a6-b055-81a87973636a

Co-authored-by: lawliet103110-art <247488912+lawliet103110-art@users.noreply.github.com>
</commit_message>
<xml_diff>
--- a/中期检查表（填写版）.docx
+++ b/中期检查表（填写版）.docx
@@ -1,6 +1,6 @@
 
 <file path=word/document.xml><?xml version="1.0" encoding="utf-8"?>
-<w:document xmlns:wpc="http://schemas.microsoft.com/office/word/2010/wordprocessingCanvas" xmlns:mo="http://schemas.microsoft.com/office/mac/office/2008/main" xmlns:mc="http://schemas.openxmlformats.org/markup-compatibility/2006" xmlns:mv="urn:schemas-microsoft-com:mac:vml" xmlns:o="urn:schemas-microsoft-com:office:office" xmlns:r="http://schemas.openxmlformats.org/officeDocument/2006/relationships" xmlns:m="http://schemas.openxmlformats.org/officeDocument/2006/math" xmlns:v="urn:schemas-microsoft-com:vml" xmlns:wp14="http://schemas.microsoft.com/office/word/2010/wordprocessingDrawing" xmlns:wp="http://schemas.openxmlformats.org/drawingml/2006/wordprocessingDrawing" xmlns:w10="urn:schemas-microsoft-com:office:word" xmlns:w="http://schemas.openxmlformats.org/wordprocessingml/2006/main" xmlns:w14="http://schemas.microsoft.com/office/word/2010/wordml" xmlns:wpg="http://schemas.microsoft.com/office/word/2010/wordprocessingGroup" xmlns:wpi="http://schemas.microsoft.com/office/word/2010/wordprocessingInk" xmlns:wne="http://schemas.microsoft.com/office/word/2006/wordml" xmlns:wps="http://schemas.microsoft.com/office/word/2010/wordprocessingShape" mc:Ignorable="w14 wp14">
+<w:document xmlns:ns1="http://schemas.openxmlformats.org/markup-compatibility/2006" xmlns:w="http://schemas.openxmlformats.org/wordprocessingml/2006/main" ns1:Ignorable="w14 wp14">
   <w:body>
     <w:p>
       <w:pPr>
@@ -396,7 +396,7 @@
               </w:rPr>
               <w:t>（1）跨模态知识迁移精度衰减问题：在输出层蒸馏过程中，学生模型仅能模仿教师模型的最终预测分布，无法直接获取教师在多模态特征融合过程中形成的中间语义表示，导致跨模态知识迁移存在一定的信息损失，学生模型在复杂多目标场景下的检测精度与教师模型仍有差距。</w:t>
               <w:br/>
-              <w:t>（2）蒸馏超参数敏感性问题：温度参数T和蒸馏权重α的取值对最终检测精度影响显著，目前尚未完成系统性的超参数搜索实验，最优配置方案有待进一步实验验证。</w:t>
+              <w:t>（2）蒸馏超参数与top_k参数敏感性问题：温度参数T、蒸馏权重α及top_k中k值的取值对最终检测精度影响显著，目前尚未完成系统性的参数搜索实验，最优配置方案有待进一步实验验证。</w:t>
               <w:br/>
               <w:t>（3）实验验证条件受限：由于K-Radar完整数据集体量较大且训练周期较长（约200个epoch），目前尚未完成完整的对比实验，暂缺乏学生模型在蒸馏前后的量化性能数据支撑。</w:t>
             </w:r>
@@ -440,9 +440,9 @@
                 <w:b w:val="0"/>
                 <w:sz w:val="22"/>
               </w:rPr>
-              <w:t>（1）针对跨模态知识迁移精度衰减：计划在现有输出层蒸馏基础上，探索引入辅助特征对齐损失（Feature Alignment Loss），对教师和学生融合模块的高层输出特征进行补充性蒸馏，以减少跨模态信息损失；同时研究不同蒸馏模式（matched vs. all）的组合策略，在保证计算效率的前提下提升知识迁移质量。</w:t>
+              <w:t>（1）针对跨模态知识迁移精度衰减：在现有输出层蒸馏框架内，重点比较matched、all与top_k等蒸馏模式，并通过查询级匹配与置信度筛选策略提升知识迁移质量，在保证计算效率的前提下减少信息损失。</w:t>
               <w:br/>
-              <w:t>（2）针对超参数敏感性：制定系统性超参数搜索方案，采用控制变量法分别对温度T（取值范围：2.0、4.0、6.0、8.0）和权重α（取值范围：0.3、0.5、0.7、0.9）进行消融实验，基于验证集mAP指标确定最优配置；同时参考MultiDistiller等相关工作的超参数设置经验，缩小搜索范围，提高实验效率。</w:t>
+              <w:t>（2）针对参数敏感性：制定系统性参数搜索方案，采用控制变量法分别对温度T（取值范围：2.0、4.0、6.0、8.0）、权重α（取值范围：0.3、0.5、0.7、0.9）以及top_k中的k（取值范围：50、100、200）进行消融实验，基于验证集mAP指标确定最优配置。</w:t>
               <w:br/>
               <w:t>（3）针对实验验证条件受限：利用K-Radar子集（前10个序列，约占完整数据集15%）进行快速验证实验，对比蒸馏前后学生模型的mAP、推理速度和模型参数量；待超参数确定后，在完整数据集上进行最终对比实验，确保实验结论的可靠性。</w:t>
             </w:r>

</xml_diff>